<commit_message>
Rescore Movable Ink 62 -> 75 after confirming HTML/CSS and Marketo/Mailchimp
Josh confirmed real, hands-on HTML/CSS experience (own Solenzo site built
directly in HTML/CSS, GA4 tracking implementation on client sites) and ESP
experience with Marketo and Mailchimp. Updated resume, cover letter,
application answer, fit score, and match report accordingly. Score moved
from a Long-shot-adjacent 62 to a stronger Solid Stretch 75, still short of
80+ since JavaScript, formal data architectures, cloud data warehousing/ETL,
and the specific flagship ESPs this posting names most (Salesforce Marketing
Cloud, Braze, Iterable) remain real, unconfirmed gaps. Added HTML/CSS and
Marketo/Mailchimp as permanent master-profile facts.

Co-Authored-By: Claude Sonnet 5 <noreply@anthropic.com>
Claude-Session: https://claude.ai/code/session_01WyTDmPmJhaMoZNuKsZg2t7
</commit_message>
<xml_diff>
--- a/applications/movable-ink-solutions-architect/Rotenberg Cover Letter - Movable Ink - Solutions Architect.docx
+++ b/applications/movable-ink-solutions-architect/Rotenberg Cover Letter - Movable Ink - Solutions Architect.docx
@@ -94,7 +94,7 @@
           <w:b w:val="0"/>
           <w:color w:val="1A1A1A"/>
         </w:rPr>
-        <w:t>Movable Ink's pitch, content personalization and AI decisioning that makes email and mobile programs feel individually built, sits squarely in territory I already work in. At Solenzo, I built a digital-footprint scoring engine that personalizes outreach off real signal instead of a static list, and a full automation system spanning lead capture through close. I've spent 15 years on the technical-implementation side of marketing technology: selling and scoping a CRM/PSA platform itself at Accelo, guiding client onboarding and API integrations as a trusted technical advisor, and translating business intent into working technical configuration.</w:t>
+        <w:t>Movable Ink's pitch, content personalization and AI decisioning that makes email and mobile programs feel individually built, sits squarely in territory I already work in. At Solenzo, I built a digital-footprint scoring engine that personalizes outreach off real signal instead of a static list, on a site I built directly in HTML/CSS, and a full automation system spanning lead capture through close. I've spent 15 years on the technical-implementation side of marketing technology: selling and scoping a CRM/PSA platform itself at Accelo, guiding client onboarding and API integrations as a trusted technical advisor, and translating business intent into working technical configuration.</w:t>
       </w:r>
     </w:p>
     <w:p>
@@ -107,7 +107,7 @@
           <w:b w:val="0"/>
           <w:color w:val="1A1A1A"/>
         </w:rPr>
-        <w:t>I want to be direct about where my background doesn't line up cleanly: I haven't worked hands-on inside an enterprise ESP like Salesforce Marketing Cloud, Braze, or Iterable, and I don't have production experience with HTML, CSS, JavaScript, or cloud data warehousing. What I do bring is a track record of picking up complex SaaS platforms fast, at Wix I onboarded and launched 25+ clients a month while holding 120% of sales and 110% of implementation targets, and the same pattern of translating ambiguous business requirements into precise technical configuration that this role calls acting as a universal translator. That's the actual mechanism of the job; the specific platform is what I'd ramp on.</w:t>
+        <w:t>My ESP experience spans Marketo and Mailchimp, and I work directly in HTML/CSS implementing GA4 tracking on client sites, real, hands-on technical work, not just campaign strategy from the outside. I want to be direct about where my background doesn't line up cleanly: I haven't worked inside the specific enterprise ESPs this role names, like Salesforce Marketing Cloud, Braze, or Iterable, and I don't have JavaScript or cloud data warehousing experience. What I do bring is a track record of picking up complex SaaS platforms fast, at Wix I onboarded and launched 25+ clients a month while holding 120% of sales and 110% of implementation targets, and the same pattern of translating ambiguous business requirements into precise technical configuration that this role calls acting as a universal translator.</w:t>
       </w:r>
     </w:p>
     <w:p>

</xml_diff>